<commit_message>
docs: integrate MDP PLY Forge technical achievements with screenshots, smart 4wd car odometry, and high-readability typography
</commit_message>
<xml_diff>
--- a/ONE_PAGE_EXECUTIVE_PROGRESS_SUMMARY.docx
+++ b/ONE_PAGE_EXECUTIVE_PROGRESS_SUMMARY.docx
@@ -4,7 +4,7 @@
   <w:body>
     <w:p>
       <w:pPr>
-        <w:spacing w:after="120"/>
+        <w:spacing w:after="20"/>
         <w:jc w:val="center"/>
       </w:pPr>
       <w:r>
@@ -20,18 +20,19 @@
         <w:rPr>
           <w:b/>
           <w:color w:val="1E3A8A"/>
-          <w:sz w:val="18"/>
+          <w:sz w:val="17"/>
         </w:rPr>
-        <w:t>EXECUTIVE PROGRESS SUMMARY: PREVIOUS MDP, CURRENT IDP, HARDWARE UPGRADE &amp; PROCUREMENT PLAN</w:t>
+        <w:t>EXECUTIVE PROGRESS SUMMARY: PRIOR MDP, CURRENT IDP, DUAL-PLATFORM DEPLOYMENT &amp; PROCUREMENT PLAN</w:t>
         <w:br/>
       </w:r>
       <w:r>
         <w:rPr>
+          <w:color w:val="64748B"/>
           <w:sz w:val="15"/>
         </w:rPr>
         <w:t>BACSE291 — Innovative Design Project | Fall 2026 | Vellore Institute of Technology (VIT), Vellore</w:t>
         <w:br/>
-        <w:t>Guide: Dr. Senthil Kumar N (Emp ID: 15377, SCOPE) | Aerial: Priyam S., Ayushman K. | Ground: Nisargkumar J. (Lead), Aryan M., Mudit G.</w:t>
+        <w:t>Guide: Dr. Senthil Kumar N (Emp ID: 15377, SCOPE) | Aerial (15377IDP01): Priyam S., Ayushman K. | Ground (15377IDP02): Nisargkumar J. (Lead), Aryan M., Mudit G.</w:t>
       </w:r>
     </w:p>
     <w:tbl>
@@ -49,75 +50,57 @@
         </w:tblBorders>
       </w:tblPr>
       <w:tblGrid>
-        <w:gridCol w:w="5544"/>
-        <w:gridCol w:w="5544"/>
+        <w:gridCol w:w="5472"/>
+        <w:gridCol w:w="5472"/>
       </w:tblGrid>
       <w:tr>
         <w:tc>
           <w:tcPr>
-            <w:tcW w:type="dxa" w:w="5544"/>
-            <w:shd w:fill="F1F5F9"/>
+            <w:tcW w:type="dxa" w:w="5472"/>
+            <w:shd w:fill="1E3A8A"/>
             <w:tcMar>
-              <w:top w:w="100" w:type="dxa"/>
-              <w:bottom w:w="100" w:type="dxa"/>
-              <w:left w:w="120" w:type="dxa"/>
-              <w:right w:w="120" w:type="dxa"/>
+              <w:top w:w="50" w:type="dxa"/>
+              <w:bottom w:w="50" w:type="dxa"/>
+              <w:left w:w="70" w:type="dxa"/>
+              <w:right w:w="70" w:type="dxa"/>
             </w:tcMar>
           </w:tcPr>
           <w:p>
+            <w:pPr>
+              <w:spacing w:line="252" w:lineRule="auto"/>
+            </w:pPr>
             <w:r>
               <w:rPr>
                 <w:b/>
+                <w:color w:val="FFFFFF"/>
                 <w:sz w:val="16"/>
               </w:rPr>
-              <w:t>1. PREVIOUS MDP: PLY FORGE (POINT CLOUD PROCESSOR)</w:t>
-              <w:br/>
-            </w:r>
-            <w:r>
-              <w:rPr>
-                <w:sz w:val="16"/>
-              </w:rPr>
-              <w:t>• Client-side WebGL 3D Point Cloud Processor built in HTML5/ES6 without external libraries.</w:t>
-              <w:br/>
-              <w:t>• Verified features: Binary/ASCII PLY parsing, circle ROI filtering, 2.5D Delaunay/grid surface triangulation, and PLY export.</w:t>
-              <w:br/>
-              <w:t>• Voxel-grid downsampling achieving 60%–85% file compression while preserving structural boundaries.</w:t>
-              <w:br/>
-              <w:t>• Cross-Project Reuse: Directly powers the ground analytics 3D WebGL digital twin rendering engine, eliminating software licensing costs.</w:t>
+              <w:t>1. PREVIOUS MDP: PLY FORGE POINT CLOUD PROCESSOR</w:t>
             </w:r>
           </w:p>
         </w:tc>
         <w:tc>
           <w:tcPr>
-            <w:tcW w:type="dxa" w:w="5544"/>
-            <w:shd w:fill="F8FAFC"/>
+            <w:tcW w:type="dxa" w:w="5472"/>
+            <w:shd w:fill="0284C7"/>
             <w:tcMar>
-              <w:top w:w="100" w:type="dxa"/>
-              <w:bottom w:w="100" w:type="dxa"/>
-              <w:left w:w="120" w:type="dxa"/>
-              <w:right w:w="120" w:type="dxa"/>
+              <w:top w:w="50" w:type="dxa"/>
+              <w:bottom w:w="50" w:type="dxa"/>
+              <w:left w:w="70" w:type="dxa"/>
+              <w:right w:w="70" w:type="dxa"/>
             </w:tcMar>
           </w:tcPr>
           <w:p>
+            <w:pPr>
+              <w:spacing w:line="252" w:lineRule="auto"/>
+            </w:pPr>
             <w:r>
               <w:rPr>
                 <w:b/>
+                <w:color w:val="FFFFFF"/>
                 <w:sz w:val="16"/>
               </w:rPr>
               <w:t>2. CURRENT IDP WORK DEVELOPED &amp; VERIFIED</w:t>
-              <w:br/>
-            </w:r>
-            <w:r>
-              <w:rPr>
-                <w:sz w:val="16"/>
-              </w:rPr>
-              <w:t>• Aerial Subsystem (15377IDP01): Benewake TF-Luna 850nm ToF (&lt;5g, 0.35W, 100 Hz) interfaced with ESP32. Firmware parses 9-byte packets, validates 0x59 0x59 sync and 8-bit checksum. Running median filter (N=5).</w:t>
-              <w:br/>
-              <w:t>• Two-Point Calibration: Universal straight-line model: y = 1.0228x + 3.20 cm (R²=1.0000, RMSE=±0.02 cm on physical benchmarks).</w:t>
-              <w:br/>
-              <w:t>• Ground Subsystem (15377IDP02): Rolling baseline residuals (Δd = d_meas - d_ref); flags spalling cavities (Δd ≥ +3.5cm) and bulges (Δd ≤ -3.5cm).</w:t>
-              <w:br/>
-              <w:t>• 3D Digital Twin: Reconstructed 9,969-point room (.PLY) isolating Almari bulge (+65cm, Orange) and Gate recess (-60cm, Green). 5-tab Streamlit dashboard active.</w:t>
             </w:r>
           </w:p>
         </w:tc>
@@ -125,75 +108,188 @@
       <w:tr>
         <w:tc>
           <w:tcPr>
-            <w:tcW w:type="dxa" w:w="5544"/>
-            <w:shd w:fill="FEF3C7"/>
+            <w:tcW w:type="dxa" w:w="5472"/>
             <w:tcMar>
-              <w:top w:w="100" w:type="dxa"/>
-              <w:bottom w:w="100" w:type="dxa"/>
-              <w:left w:w="120" w:type="dxa"/>
-              <w:right w:w="120" w:type="dxa"/>
+              <w:top w:w="50" w:type="dxa"/>
+              <w:bottom w:w="50" w:type="dxa"/>
+              <w:left w:w="70" w:type="dxa"/>
+              <w:right w:w="70" w:type="dxa"/>
             </w:tcMar>
           </w:tcPr>
           <w:p>
+            <w:pPr>
+              <w:spacing w:line="252" w:lineRule="auto"/>
+            </w:pPr>
             <w:r>
               <w:rPr>
-                <w:b/>
-                <w:sz w:val="16"/>
+                <w:sz w:val="14"/>
               </w:rPr>
-              <w:t>3. HARDWARE UPGRADES &amp; PROCUREMENT BUDGET</w:t>
+              <w:t>• Architecture: Client-side WebGL 1.0 3D point cloud processor in HTML5/ES6 without external libraries (no Three.js, no Node.js backend).</w:t>
               <w:br/>
-            </w:r>
-            <w:r>
-              <w:rPr>
-                <w:sz w:val="16"/>
-              </w:rPr>
-              <w:t>• Engineering Need: Manual sliding jitter (~2–3 cm) and sensor tilt elongation (d_true = d_meas · cos θ) require dedicated sensing and airframe mobility.</w:t>
+              <w:t>• Core Capabilities: Binary/ASCII PLY parser (DataView/ArrayBuffer), 18,000-pt Stanford Bunny demo, circle ROI filtering, 2.5D Delaunay/grid meshing, and PLY export.</w:t>
               <w:br/>
-              <w:t>• YDLIDAR X2 360° LiDAR: 3,000 pts/s, 7 Hz continuous planar slicing, 0.12–8.0m range, 3.3V UART (115200 bps). Ref price: ₹7,189.00.</w:t>
+              <w:t>• Voxel Downsampling: Spatial hash map downsampling point clouds by 60%–90% while preserving structural boundaries.</w:t>
               <w:br/>
-              <w:t>• DFRobot Gravity Tilt Sensor: 360° ball switch detecting pitch/roll to apply trigonometric compensation in ESP32 firmware. Ref price: ₹245.00.</w:t>
-              <w:br/>
-              <w:t>• F450 Drone Kit + Pixhawk: F450 frame, 4x 2212 motors, 4x 30A ESCs, Pixhawk 2.4.8 autopilot, 1045 props. Subtotal: ₹12,020.00.</w:t>
-              <w:br/>
-              <w:t>• Power &amp; Mounting: 3S 4200mAh 35C LiPo (₹2,450), iMAX B6 charger (₹1,350), 5V 5A UBEC (₹380), silicone damper &amp; wiring (₹740).</w:t>
-              <w:br/>
-              <w:t>• TOTAL BUDGET: Essential: ₹24,724 | Shipping: ₹400 | Contingency (8%): ₹2,000 | TOTAL: ₹27,124.00 INR (MVP Option: ₹8,214.00).</w:t>
+              <w:t>• Direct IDP Role: Directly embedded into Ground Station Tab 4 (Streamlit WebGL Viewer) for zero-latency 3D facade rendering without external software.</w:t>
             </w:r>
           </w:p>
         </w:tc>
         <w:tc>
           <w:tcPr>
-            <w:tcW w:type="dxa" w:w="5544"/>
-            <w:shd w:fill="ECFDF5"/>
+            <w:tcW w:type="dxa" w:w="5472"/>
             <w:tcMar>
-              <w:top w:w="100" w:type="dxa"/>
-              <w:bottom w:w="100" w:type="dxa"/>
-              <w:left w:w="120" w:type="dxa"/>
-              <w:right w:w="120" w:type="dxa"/>
+              <w:top w:w="50" w:type="dxa"/>
+              <w:bottom w:w="50" w:type="dxa"/>
+              <w:left w:w="70" w:type="dxa"/>
+              <w:right w:w="70" w:type="dxa"/>
             </w:tcMar>
           </w:tcPr>
           <w:p>
+            <w:pPr>
+              <w:spacing w:line="252" w:lineRule="auto"/>
+            </w:pPr>
+            <w:r>
+              <w:rPr>
+                <w:sz w:val="14"/>
+              </w:rPr>
+              <w:t>• Aerial Sensing (15377IDP01): Calibrated Benewake TF-Luna 850nm dToF (&lt;5g, 0.35W, 100 Hz) on ESP32 FreeRTOS. UART sync to 0x59 0x59 with checksum and median filter (N=5).</w:t>
+              <w:br/>
+              <w:t>• Empirical Metrology Fit: Universal model: y = 1.0228x + 3.20 cm (R²=1.0000, RMSE=±0.02 cm across 39.0cm and 61.4cm physical benchmarks).</w:t>
+              <w:br/>
+              <w:t>• Ground Analytics (15377IDP02): Rolling baseline tracking calculating residuals (Δd); flags spalls (Δd ≥ +3.5cm) and bulges (Δd ≤ -3.5cm).</w:t>
+              <w:br/>
+              <w:t>• 3D Digital Twin: Reconstructed 9,969-point room (.PLY) isolating Almari bulge (+65cm) and Gate recess (-60cm). 5-tab Streamlit dashboard.</w:t>
+            </w:r>
+          </w:p>
+        </w:tc>
+      </w:tr>
+    </w:tbl>
+    <w:tbl>
+      <w:tblPr>
+        <w:tblW w:type="auto" w:w="0"/>
+        <w:jc w:val="center"/>
+        <w:tblLook w:firstColumn="1" w:firstRow="1" w:lastColumn="0" w:lastRow="0" w:noHBand="0" w:noVBand="1" w:val="04A0"/>
+        <w:tblBorders>
+          <w:top w:val="single" w:sz="4" w:space="0" w:color="CBD5E1"/>
+          <w:bottom w:val="single" w:sz="4" w:space="0" w:color="CBD5E1"/>
+          <w:left w:val="single" w:sz="4" w:space="0" w:color="CBD5E1"/>
+          <w:right w:val="single" w:sz="4" w:space="0" w:color="CBD5E1"/>
+          <w:insideH w:val="single" w:sz="4" w:space="0" w:color="CBD5E1"/>
+          <w:insideV w:val="single" w:sz="4" w:space="0" w:color="CBD5E1"/>
+        </w:tblBorders>
+      </w:tblPr>
+      <w:tblGrid>
+        <w:gridCol w:w="5472"/>
+        <w:gridCol w:w="5472"/>
+      </w:tblGrid>
+      <w:tr>
+        <w:tc>
+          <w:tcPr>
+            <w:tcW w:type="dxa" w:w="5472"/>
+            <w:shd w:fill="D97706"/>
+            <w:tcMar>
+              <w:top w:w="50" w:type="dxa"/>
+              <w:bottom w:w="50" w:type="dxa"/>
+              <w:left w:w="70" w:type="dxa"/>
+              <w:right w:w="70" w:type="dxa"/>
+            </w:tcMar>
+          </w:tcPr>
+          <w:p>
+            <w:pPr>
+              <w:spacing w:line="252" w:lineRule="auto"/>
+            </w:pPr>
             <w:r>
               <w:rPr>
                 <w:b/>
+                <w:color w:val="FFFFFF"/>
+                <w:sz w:val="16"/>
+              </w:rPr>
+              <w:t>3. DUAL-PLATFORM STRATEGY &amp; HARDWARE UPGRADES</w:t>
+            </w:r>
+          </w:p>
+        </w:tc>
+        <w:tc>
+          <w:tcPr>
+            <w:tcW w:type="dxa" w:w="5472"/>
+            <w:shd w:fill="059669"/>
+            <w:tcMar>
+              <w:top w:w="50" w:type="dxa"/>
+              <w:bottom w:w="50" w:type="dxa"/>
+              <w:left w:w="70" w:type="dxa"/>
+              <w:right w:w="70" w:type="dxa"/>
+            </w:tcMar>
+          </w:tcPr>
+          <w:p>
+            <w:pPr>
+              <w:spacing w:line="252" w:lineRule="auto"/>
+            </w:pPr>
+            <w:r>
+              <w:rPr>
+                <w:b/>
+                <w:color w:val="FFFFFF"/>
                 <w:sz w:val="16"/>
               </w:rPr>
               <w:t>4. FUTURE ROADMAP &amp; SYSTEM INTEGRATION</w:t>
-              <w:br/>
             </w:r>
+          </w:p>
+        </w:tc>
+      </w:tr>
+      <w:tr>
+        <w:tc>
+          <w:tcPr>
+            <w:tcW w:type="dxa" w:w="5472"/>
+            <w:tcMar>
+              <w:top w:w="50" w:type="dxa"/>
+              <w:bottom w:w="50" w:type="dxa"/>
+              <w:left w:w="70" w:type="dxa"/>
+              <w:right w:w="70" w:type="dxa"/>
+            </w:tcMar>
+          </w:tcPr>
+          <w:p>
+            <w:pPr>
+              <w:spacing w:line="252" w:lineRule="auto"/>
+            </w:pPr>
             <w:r>
               <w:rPr>
-                <w:sz w:val="16"/>
+                <w:sz w:val="14"/>
               </w:rPr>
-              <w:t>• Phase 1–2 (Weeks 1–3): Procure Priority 1 hardware (LiDAR, tilt sensor, UBEC); verify UART framing and 5V rail brownout protection on bench.</w:t>
+              <w:t>• Platform Duality: (1) Autonomous F450 Drone: Elevated facade inspection; (2) Smart 4WD Ground Car: Indoor corridors, eliminating prop-wash suction &amp; hand jitter.</w:t>
               <w:br/>
-              <w:t>• Phase 3–4 (Weeks 4–6): Implement firmware tilt compensation (d_true = d_cal · cos θ); assemble F450 quadcopter airframe; balance center of gravity; install silicone vibration isolation deck (&gt;18 dB attenuation).</w:t>
+              <w:t>• Smart 4WD Car Odometry: Dual 20-slot optical wheel encoders integrate distance at ~1.02 mm/tick; closed-loop PID maintains constant 5.0 cm/s traverse; coordinates: (X_enc, d_meas*cosθ, Z_mast).</w:t>
               <w:br/>
-              <w:t>• Phase 5–6 (Weeks 7–9): Adapt PLY Forge WebGL engine for streaming UDP point cloud buffers; conduct tethered hover flight trials; scan facade with calibrated 2cm &amp; 3.5cm simulated spalls.</w:t>
+              <w:t>• YDLIDAR X2 360° LiDAR (INR 7,189): 3,000 pts/s, 7 Hz planar rotation, capturing full 2D cross-sectional wall slices in 142 ms.</w:t>
               <w:br/>
-              <w:t>• Phase 7 (Week 10): End-to-end faculty demonstration, automated PDF inspection report generation, and longitudinal deterioration baseline establishment.</w:t>
+              <w:t>• DFRobot Gravity Tilt Sensor (INR 245): Instant pitch/roll correction: d_true = d_meas*cos(θ), eliminating 3.1 cm artificial elongation false cavities.</w:t>
+            </w:r>
+          </w:p>
+        </w:tc>
+        <w:tc>
+          <w:tcPr>
+            <w:tcW w:type="dxa" w:w="5472"/>
+            <w:tcMar>
+              <w:top w:w="50" w:type="dxa"/>
+              <w:bottom w:w="50" w:type="dxa"/>
+              <w:left w:w="70" w:type="dxa"/>
+              <w:right w:w="70" w:type="dxa"/>
+            </w:tcMar>
+          </w:tcPr>
+          <w:p>
+            <w:pPr>
+              <w:spacing w:line="252" w:lineRule="auto"/>
+            </w:pPr>
+            <w:r>
+              <w:rPr>
+                <w:sz w:val="14"/>
+              </w:rPr>
+              <w:t>• Phase 1–2 (Weeks 1–3): Procure Tier 1 hardware (LiDAR, tilt sensor, 4WD car kit); verify UART framing and 5V rail regulation.</w:t>
               <w:br/>
-              <w:t>• Target Metrics: Static distance MAE ≤ ±0.5cm; Tilt error residual ≤ ±1.0cm; Defect detection precision ≥ 90%, recall ≥ 85%; Continuous hover flight time ≥ 14 mins.</w:t>
+              <w:t>• Phase 3–4 (Weeks 4–6): Assemble F450 airframe &amp; propulsion; implement silicone vibration-damping deck (&gt;18 dB attenuation); benchmark hover thrust.</w:t>
+              <w:br/>
+              <w:t>• Phase 5–6 (Weeks 7–10): Laboratory wall scanning with Smart 4WD car (encoder odometry); tethered facade flights; blind defect detection.</w:t>
+              <w:br/>
+              <w:t>• Phase 7 (Weeks 11–14): End-to-end integration, Streamlit PLY Forge 3D meshing, automated compliance PDF reports, and IEEE submission.</w:t>
+              <w:br/>
+              <w:t>• Target Metrics: Static distance RMSE ≤ ±1.5cm; Tilt residual ≤ 0.5cm; Defect sensitivity ≥ 95%; Car odometry drift ≤ 1.0cm / 5m.</w:t>
             </w:r>
           </w:p>
         </w:tc>
@@ -201,7 +297,7 @@
     </w:tbl>
     <w:p>
       <w:pPr>
-        <w:spacing w:after="120"/>
+        <w:spacing w:after="40"/>
       </w:pPr>
     </w:p>
     <w:tbl>
@@ -219,23 +315,32 @@
         </w:tblBorders>
       </w:tblPr>
       <w:tblGrid>
-        <w:gridCol w:w="2772"/>
-        <w:gridCol w:w="2772"/>
-        <w:gridCol w:w="2772"/>
-        <w:gridCol w:w="2772"/>
+        <w:gridCol w:w="2736"/>
+        <w:gridCol w:w="2736"/>
+        <w:gridCol w:w="2736"/>
+        <w:gridCol w:w="2736"/>
       </w:tblGrid>
       <w:tr>
         <w:tc>
           <w:tcPr>
-            <w:tcW w:type="dxa" w:w="2772"/>
-            <w:shd w:fill="0F172A"/>
+            <w:tcW w:type="dxa" w:w="2736"/>
+            <w:shd w:fill="1E3A8A"/>
+            <w:tcMar>
+              <w:top w:w="40" w:type="dxa"/>
+              <w:bottom w:w="40" w:type="dxa"/>
+              <w:left w:w="60" w:type="dxa"/>
+              <w:right w:w="60" w:type="dxa"/>
+            </w:tcMar>
           </w:tcPr>
           <w:p>
+            <w:pPr>
+              <w:spacing w:line="252" w:lineRule="auto"/>
+            </w:pPr>
             <w:r>
               <w:rPr>
                 <w:b/>
                 <w:color w:val="FFFFFF"/>
-                <w:sz w:val="16"/>
+                <w:sz w:val="15"/>
               </w:rPr>
               <w:t>Component Group</w:t>
             </w:r>
@@ -243,31 +348,49 @@
         </w:tc>
         <w:tc>
           <w:tcPr>
-            <w:tcW w:type="dxa" w:w="2772"/>
-            <w:shd w:fill="0F172A"/>
+            <w:tcW w:type="dxa" w:w="2736"/>
+            <w:shd w:fill="1E3A8A"/>
+            <w:tcMar>
+              <w:top w:w="40" w:type="dxa"/>
+              <w:bottom w:w="40" w:type="dxa"/>
+              <w:left w:w="60" w:type="dxa"/>
+              <w:right w:w="60" w:type="dxa"/>
+            </w:tcMar>
           </w:tcPr>
           <w:p>
+            <w:pPr>
+              <w:spacing w:line="252" w:lineRule="auto"/>
+            </w:pPr>
             <w:r>
               <w:rPr>
                 <w:b/>
                 <w:color w:val="FFFFFF"/>
-                <w:sz w:val="16"/>
+                <w:sz w:val="15"/>
               </w:rPr>
-              <w:t>Key Inclusions</w:t>
+              <w:t>Key Inclusions &amp; Specifications</w:t>
             </w:r>
           </w:p>
         </w:tc>
         <w:tc>
           <w:tcPr>
-            <w:tcW w:type="dxa" w:w="2772"/>
-            <w:shd w:fill="0F172A"/>
+            <w:tcW w:type="dxa" w:w="2736"/>
+            <w:shd w:fill="1E3A8A"/>
+            <w:tcMar>
+              <w:top w:w="40" w:type="dxa"/>
+              <w:bottom w:w="40" w:type="dxa"/>
+              <w:left w:w="60" w:type="dxa"/>
+              <w:right w:w="60" w:type="dxa"/>
+            </w:tcMar>
           </w:tcPr>
           <w:p>
+            <w:pPr>
+              <w:spacing w:line="252" w:lineRule="auto"/>
+            </w:pPr>
             <w:r>
               <w:rPr>
                 <w:b/>
                 <w:color w:val="FFFFFF"/>
-                <w:sz w:val="16"/>
+                <w:sz w:val="15"/>
               </w:rPr>
               <w:t>Cost (INR)</w:t>
             </w:r>
@@ -275,15 +398,24 @@
         </w:tc>
         <w:tc>
           <w:tcPr>
-            <w:tcW w:type="dxa" w:w="2772"/>
-            <w:shd w:fill="0F172A"/>
+            <w:tcW w:type="dxa" w:w="2736"/>
+            <w:shd w:fill="1E3A8A"/>
+            <w:tcMar>
+              <w:top w:w="40" w:type="dxa"/>
+              <w:bottom w:w="40" w:type="dxa"/>
+              <w:left w:w="60" w:type="dxa"/>
+              <w:right w:w="60" w:type="dxa"/>
+            </w:tcMar>
           </w:tcPr>
           <w:p>
+            <w:pPr>
+              <w:spacing w:line="252" w:lineRule="auto"/>
+            </w:pPr>
             <w:r>
               <w:rPr>
                 <w:b/>
                 <w:color w:val="FFFFFF"/>
-                <w:sz w:val="16"/>
+                <w:sz w:val="15"/>
               </w:rPr>
               <w:t>Procurement Phasing</w:t>
             </w:r>
@@ -293,53 +425,89 @@
       <w:tr>
         <w:tc>
           <w:tcPr>
-            <w:tcW w:type="dxa" w:w="2772"/>
+            <w:tcW w:type="dxa" w:w="2736"/>
+            <w:tcMar>
+              <w:top w:w="40" w:type="dxa"/>
+              <w:bottom w:w="40" w:type="dxa"/>
+              <w:left w:w="60" w:type="dxa"/>
+              <w:right w:w="60" w:type="dxa"/>
+            </w:tcMar>
           </w:tcPr>
           <w:p>
+            <w:pPr>
+              <w:spacing w:line="252" w:lineRule="auto"/>
+            </w:pPr>
             <w:r>
               <w:rPr>
-                <w:sz w:val="15"/>
+                <w:sz w:val="14"/>
               </w:rPr>
-              <w:t>Sensors &amp; Power Regulation</w:t>
+              <w:t>Sensors &amp; Contingency Car</w:t>
             </w:r>
           </w:p>
         </w:tc>
         <w:tc>
           <w:tcPr>
-            <w:tcW w:type="dxa" w:w="2772"/>
+            <w:tcW w:type="dxa" w:w="2736"/>
+            <w:tcMar>
+              <w:top w:w="40" w:type="dxa"/>
+              <w:bottom w:w="40" w:type="dxa"/>
+              <w:left w:w="60" w:type="dxa"/>
+              <w:right w:w="60" w:type="dxa"/>
+            </w:tcMar>
           </w:tcPr>
           <w:p>
+            <w:pPr>
+              <w:spacing w:line="252" w:lineRule="auto"/>
+            </w:pPr>
             <w:r>
               <w:rPr>
-                <w:sz w:val="15"/>
+                <w:sz w:val="14"/>
               </w:rPr>
-              <w:t>YDLIDAR X2 360° LiDAR (₹7,189), DFRobot Tilt Sensor (₹245), 5V 5A UBEC (₹380)</w:t>
+              <w:t>YDLIDAR X2 360° LiDAR (INR 7,189), DFRobot Tilt (INR 245), Smart 4WD Car + Encoders (INR 1,750), Buck (INR 240)</w:t>
             </w:r>
           </w:p>
         </w:tc>
         <w:tc>
           <w:tcPr>
-            <w:tcW w:type="dxa" w:w="2772"/>
+            <w:tcW w:type="dxa" w:w="2736"/>
+            <w:tcMar>
+              <w:top w:w="40" w:type="dxa"/>
+              <w:bottom w:w="40" w:type="dxa"/>
+              <w:left w:w="60" w:type="dxa"/>
+              <w:right w:w="60" w:type="dxa"/>
+            </w:tcMar>
           </w:tcPr>
           <w:p>
+            <w:pPr>
+              <w:spacing w:line="252" w:lineRule="auto"/>
+            </w:pPr>
             <w:r>
               <w:rPr>
-                <w:sz w:val="15"/>
+                <w:sz w:val="14"/>
               </w:rPr>
-              <w:t>₹7,814.00</w:t>
+              <w:t>INR 9,424.00</w:t>
             </w:r>
           </w:p>
         </w:tc>
         <w:tc>
           <w:tcPr>
-            <w:tcW w:type="dxa" w:w="2772"/>
+            <w:tcW w:type="dxa" w:w="2736"/>
+            <w:tcMar>
+              <w:top w:w="40" w:type="dxa"/>
+              <w:bottom w:w="40" w:type="dxa"/>
+              <w:left w:w="60" w:type="dxa"/>
+              <w:right w:w="60" w:type="dxa"/>
+            </w:tcMar>
           </w:tcPr>
           <w:p>
+            <w:pPr>
+              <w:spacing w:line="252" w:lineRule="auto"/>
+            </w:pPr>
             <w:r>
               <w:rPr>
-                <w:sz w:val="15"/>
+                <w:sz w:val="14"/>
               </w:rPr>
-              <w:t>Priority 1 (Immediate / Week 1–2)</w:t>
+              <w:t>Tier 1 (Immediate Critical / Weeks 1–2)</w:t>
             </w:r>
           </w:p>
         </w:tc>
@@ -347,13 +515,21 @@
       <w:tr>
         <w:tc>
           <w:tcPr>
-            <w:tcW w:type="dxa" w:w="2772"/>
-            <w:shd w:fill="F8FAFC"/>
+            <w:tcW w:type="dxa" w:w="2736"/>
+            <w:tcMar>
+              <w:top w:w="40" w:type="dxa"/>
+              <w:bottom w:w="40" w:type="dxa"/>
+              <w:left w:w="60" w:type="dxa"/>
+              <w:right w:w="60" w:type="dxa"/>
+            </w:tcMar>
           </w:tcPr>
           <w:p>
+            <w:pPr>
+              <w:spacing w:line="252" w:lineRule="auto"/>
+            </w:pPr>
             <w:r>
               <w:rPr>
-                <w:sz w:val="15"/>
+                <w:sz w:val="14"/>
               </w:rPr>
               <w:t>Airframe &amp; Power Reservoir</w:t>
             </w:r>
@@ -361,43 +537,67 @@
         </w:tc>
         <w:tc>
           <w:tcPr>
-            <w:tcW w:type="dxa" w:w="2772"/>
-            <w:shd w:fill="F8FAFC"/>
+            <w:tcW w:type="dxa" w:w="2736"/>
+            <w:tcMar>
+              <w:top w:w="40" w:type="dxa"/>
+              <w:bottom w:w="40" w:type="dxa"/>
+              <w:left w:w="60" w:type="dxa"/>
+              <w:right w:w="60" w:type="dxa"/>
+            </w:tcMar>
           </w:tcPr>
           <w:p>
+            <w:pPr>
+              <w:spacing w:line="252" w:lineRule="auto"/>
+            </w:pPr>
             <w:r>
               <w:rPr>
-                <w:sz w:val="15"/>
+                <w:sz w:val="14"/>
               </w:rPr>
-              <w:t>F450 Frame Kit + Motors + ESCs (₹5,200), 3S 4200mAh LiPo &amp; B6 Charger (₹3,800), Dampers (₹740)</w:t>
+              <w:t>F450 Frame + 4x Motors + 4x ESCs (INR 5,200), 1045 Props (INR 260), 3S 4200mAh LiPo &amp; B6 Charger (INR 4,430)</w:t>
             </w:r>
           </w:p>
         </w:tc>
         <w:tc>
           <w:tcPr>
-            <w:tcW w:type="dxa" w:w="2772"/>
-            <w:shd w:fill="F8FAFC"/>
+            <w:tcW w:type="dxa" w:w="2736"/>
+            <w:tcMar>
+              <w:top w:w="40" w:type="dxa"/>
+              <w:bottom w:w="40" w:type="dxa"/>
+              <w:left w:w="60" w:type="dxa"/>
+              <w:right w:w="60" w:type="dxa"/>
+            </w:tcMar>
           </w:tcPr>
           <w:p>
+            <w:pPr>
+              <w:spacing w:line="252" w:lineRule="auto"/>
+            </w:pPr>
             <w:r>
               <w:rPr>
-                <w:sz w:val="15"/>
+                <w:sz w:val="14"/>
               </w:rPr>
-              <w:t>₹9,740.00</w:t>
+              <w:t>INR 9,890.00</w:t>
             </w:r>
           </w:p>
         </w:tc>
         <w:tc>
           <w:tcPr>
-            <w:tcW w:type="dxa" w:w="2772"/>
-            <w:shd w:fill="F8FAFC"/>
+            <w:tcW w:type="dxa" w:w="2736"/>
+            <w:tcMar>
+              <w:top w:w="40" w:type="dxa"/>
+              <w:bottom w:w="40" w:type="dxa"/>
+              <w:left w:w="60" w:type="dxa"/>
+              <w:right w:w="60" w:type="dxa"/>
+            </w:tcMar>
           </w:tcPr>
           <w:p>
+            <w:pPr>
+              <w:spacing w:line="252" w:lineRule="auto"/>
+            </w:pPr>
             <w:r>
               <w:rPr>
-                <w:sz w:val="15"/>
+                <w:sz w:val="14"/>
               </w:rPr>
-              <w:t>Priority 2 (Integration / Week 3–4)</w:t>
+              <w:t>Tier 2 (UAV Assembly / Weeks 3–4)</w:t>
             </w:r>
           </w:p>
         </w:tc>
@@ -405,53 +605,89 @@
       <w:tr>
         <w:tc>
           <w:tcPr>
-            <w:tcW w:type="dxa" w:w="2772"/>
+            <w:tcW w:type="dxa" w:w="2736"/>
+            <w:tcMar>
+              <w:top w:w="40" w:type="dxa"/>
+              <w:bottom w:w="40" w:type="dxa"/>
+              <w:left w:w="60" w:type="dxa"/>
+              <w:right w:w="60" w:type="dxa"/>
+            </w:tcMar>
           </w:tcPr>
           <w:p>
+            <w:pPr>
+              <w:spacing w:line="252" w:lineRule="auto"/>
+            </w:pPr>
             <w:r>
               <w:rPr>
-                <w:sz w:val="15"/>
+                <w:sz w:val="14"/>
               </w:rPr>
-              <w:t>Avionics &amp; Contingency</w:t>
+              <w:t>Avionics, Shipping &amp; Reserve</w:t>
             </w:r>
           </w:p>
         </w:tc>
         <w:tc>
           <w:tcPr>
-            <w:tcW w:type="dxa" w:w="2772"/>
+            <w:tcW w:type="dxa" w:w="2736"/>
+            <w:tcMar>
+              <w:top w:w="40" w:type="dxa"/>
+              <w:bottom w:w="40" w:type="dxa"/>
+              <w:left w:w="60" w:type="dxa"/>
+              <w:right w:w="60" w:type="dxa"/>
+            </w:tcMar>
           </w:tcPr>
           <w:p>
+            <w:pPr>
+              <w:spacing w:line="252" w:lineRule="auto"/>
+            </w:pPr>
             <w:r>
               <w:rPr>
-                <w:sz w:val="15"/>
+                <w:sz w:val="14"/>
               </w:rPr>
-              <w:t>Pixhawk 2.4.8 Autopilot + GPS Kit (₹6,850), Courier Shipping (₹400), Risk Reserve (₹2,000)</w:t>
+              <w:t>Pixhawk 2.4.8 Kit (INR 5,950), ESP32 (INR 380), Dampers/Wire (INR 570), Shipping (INR 400), Contingency (INR 2,000)</w:t>
             </w:r>
           </w:p>
         </w:tc>
         <w:tc>
           <w:tcPr>
-            <w:tcW w:type="dxa" w:w="2772"/>
+            <w:tcW w:type="dxa" w:w="2736"/>
+            <w:tcMar>
+              <w:top w:w="40" w:type="dxa"/>
+              <w:bottom w:w="40" w:type="dxa"/>
+              <w:left w:w="60" w:type="dxa"/>
+              <w:right w:w="60" w:type="dxa"/>
+            </w:tcMar>
           </w:tcPr>
           <w:p>
+            <w:pPr>
+              <w:spacing w:line="252" w:lineRule="auto"/>
+            </w:pPr>
             <w:r>
               <w:rPr>
-                <w:sz w:val="15"/>
+                <w:sz w:val="14"/>
               </w:rPr>
-              <w:t>₹9,250.00</w:t>
+              <w:t>INR 9,300.00</w:t>
             </w:r>
           </w:p>
         </w:tc>
         <w:tc>
           <w:tcPr>
-            <w:tcW w:type="dxa" w:w="2772"/>
+            <w:tcW w:type="dxa" w:w="2736"/>
+            <w:tcMar>
+              <w:top w:w="40" w:type="dxa"/>
+              <w:bottom w:w="40" w:type="dxa"/>
+              <w:left w:w="60" w:type="dxa"/>
+              <w:right w:w="60" w:type="dxa"/>
+            </w:tcMar>
           </w:tcPr>
           <w:p>
+            <w:pPr>
+              <w:spacing w:line="252" w:lineRule="auto"/>
+            </w:pPr>
             <w:r>
               <w:rPr>
-                <w:sz w:val="15"/>
+                <w:sz w:val="14"/>
               </w:rPr>
-              <w:t>Priority 3 (Flight Trials / Week 5–6)</w:t>
+              <w:t>Tier 3 (Flight Trials / Weeks 5–6)</w:t>
             </w:r>
           </w:p>
         </w:tc>
@@ -459,90 +695,109 @@
       <w:tr>
         <w:tc>
           <w:tcPr>
-            <w:tcW w:type="dxa" w:w="2772"/>
-            <w:shd w:fill="1E3A8A"/>
+            <w:tcW w:type="dxa" w:w="2736"/>
+            <w:shd w:fill="0F172A"/>
+            <w:tcMar>
+              <w:top w:w="40" w:type="dxa"/>
+              <w:bottom w:w="40" w:type="dxa"/>
+              <w:left w:w="60" w:type="dxa"/>
+              <w:right w:w="60" w:type="dxa"/>
+            </w:tcMar>
           </w:tcPr>
           <w:p>
+            <w:pPr>
+              <w:spacing w:line="252" w:lineRule="auto"/>
+            </w:pPr>
             <w:r>
               <w:rPr>
                 <w:b/>
                 <w:color w:val="FFFFFF"/>
-                <w:sz w:val="15"/>
+                <w:sz w:val="14"/>
               </w:rPr>
-              <w:t>TOTAL RECOMMENDED GRANT</w:t>
+              <w:t>TOTAL DUAL-PLATFORM BUDGET</w:t>
             </w:r>
           </w:p>
         </w:tc>
         <w:tc>
           <w:tcPr>
-            <w:tcW w:type="dxa" w:w="2772"/>
-            <w:shd w:fill="1E3A8A"/>
+            <w:tcW w:type="dxa" w:w="2736"/>
+            <w:shd w:fill="0F172A"/>
+            <w:tcMar>
+              <w:top w:w="40" w:type="dxa"/>
+              <w:bottom w:w="40" w:type="dxa"/>
+              <w:left w:w="60" w:type="dxa"/>
+              <w:right w:w="60" w:type="dxa"/>
+            </w:tcMar>
           </w:tcPr>
           <w:p>
+            <w:pPr>
+              <w:spacing w:line="252" w:lineRule="auto"/>
+            </w:pPr>
             <w:r>
               <w:rPr>
                 <w:b/>
                 <w:color w:val="FFFFFF"/>
-                <w:sz w:val="15"/>
+                <w:sz w:val="14"/>
               </w:rPr>
-              <w:t>Complete Airborne Cyber-Physical SHM System (MVP Bench Option: ₹8,214.00)</w:t>
+              <w:t>Complete Airborne UAV &amp; Smart 4WD Ground Robotic Car Systems</w:t>
             </w:r>
           </w:p>
         </w:tc>
         <w:tc>
           <w:tcPr>
-            <w:tcW w:type="dxa" w:w="2772"/>
-            <w:shd w:fill="1E3A8A"/>
+            <w:tcW w:type="dxa" w:w="2736"/>
+            <w:shd w:fill="0F172A"/>
+            <w:tcMar>
+              <w:top w:w="40" w:type="dxa"/>
+              <w:bottom w:w="40" w:type="dxa"/>
+              <w:left w:w="60" w:type="dxa"/>
+              <w:right w:w="60" w:type="dxa"/>
+            </w:tcMar>
           </w:tcPr>
           <w:p>
+            <w:pPr>
+              <w:spacing w:line="252" w:lineRule="auto"/>
+            </w:pPr>
             <w:r>
               <w:rPr>
                 <w:b/>
                 <w:color w:val="FFFFFF"/>
-                <w:sz w:val="15"/>
+                <w:sz w:val="14"/>
               </w:rPr>
-              <w:t>₹27,124.00</w:t>
+              <w:t>INR 28,874.00</w:t>
             </w:r>
           </w:p>
         </w:tc>
         <w:tc>
           <w:tcPr>
-            <w:tcW w:type="dxa" w:w="2772"/>
-            <w:shd w:fill="1E3A8A"/>
+            <w:tcW w:type="dxa" w:w="2736"/>
+            <w:shd w:fill="0F172A"/>
+            <w:tcMar>
+              <w:top w:w="40" w:type="dxa"/>
+              <w:bottom w:w="40" w:type="dxa"/>
+              <w:left w:w="60" w:type="dxa"/>
+              <w:right w:w="60" w:type="dxa"/>
+            </w:tcMar>
           </w:tcPr>
           <w:p>
+            <w:pPr>
+              <w:spacing w:line="252" w:lineRule="auto"/>
+            </w:pPr>
             <w:r>
               <w:rPr>
                 <w:b/>
                 <w:color w:val="FFFFFF"/>
-                <w:sz w:val="15"/>
+                <w:sz w:val="14"/>
               </w:rPr>
-              <w:t>Faculty Sign-Off Ready</w:t>
+              <w:t>Ground MVP Option: INR 9,964.00</w:t>
             </w:r>
           </w:p>
         </w:tc>
       </w:tr>
     </w:tbl>
-    <w:p>
-      <w:pPr>
-        <w:spacing w:after="80"/>
-      </w:pPr>
-    </w:p>
-    <w:p>
-      <w:pPr>
-        <w:jc w:val="center"/>
-      </w:pPr>
-      <w:r>
-        <w:rPr>
-          <w:i/>
-          <w:sz w:val="15"/>
-        </w:rPr>
-        <w:t>Project Leads: Nisargkumar Joshi (25BCE0594, Ground Lead) &amp; Priyam Sharma (25BAI0159, Aerial Lead) | Guide Sign-off: Dr. Senthil Kumar N (Associate Professor Grade 2, SCOPE) | Date: October 24, 2026</w:t>
-      </w:r>
-    </w:p>
     <w:sectPr>
       <w:pgSz w:w="12240" w:h="15840"/>
-      <w:pgMar w:top="576" w:right="576" w:bottom="576" w:left="576" w:header="720" w:footer="720" w:gutter="0"/>
+      <w:pgMar w:top="576" w:right="648" w:bottom="576" w:left="648" w:header="720" w:footer="720" w:gutter="0"/>
       <w:cols w:space="720"/>
       <w:docGrid w:linePitch="360"/>
     </w:sectPr>

</xml_diff>